<commit_message>
Added grile for Web exam
</commit_message>
<xml_diff>
--- a/Anul 2/Medii de Programare si Proiectare/Examen/Teorie_Sumar.docx
+++ b/Anul 2/Medii de Programare si Proiectare/Examen/Teorie_Sumar.docx
@@ -370,7 +370,19 @@
         <w:rPr>
           <w:rFonts w:ascii="Times New Roman" w:hAnsi="Times New Roman" w:cs="Times New Roman"/>
         </w:rPr>
-        <w:t xml:space="preserve"> Reprezintă diferențele și incompatibilitățile conceptuale dintre dezvoltarea orientată pe obiecte și modelul bazelor de date relaționale. În timp ce modelul obiectual se bazează pe clase, navigare prin referințe, tipuri complexe, polimorfism și moștenire, bazele de date se bazează pe structuri tabelare, chei străine, join-uri și tipuri primitive de date. Un instrument ORM este necesar pentru a compensa aceste diferențe (rezolvând referințele sau generând SQL dinamic) fără pierderi de informații.</w:t>
+        <w:t xml:space="preserve"> Reprezintă diferențele și incompatibilitățile conceptuale dintre dezvoltarea orientată pe obiecte și modelul bazelor de date relaționale. În timp ce modelul obiectual se bazează pe clase, navigare prin referințe, tipuri complexe, polimorfism și moștenire, bazele de date se bazează pe structuri tabelare, chei străine, join-uri și tipuri primitive de date. Un instrument ORM este necesar pentru a compensa aceste diferențe (rezolvând referințele sa</w:t>
+      </w:r>
+      <w:r>
+        <w:rPr>
+          <w:rFonts w:ascii="Times New Roman" w:hAnsi="Times New Roman" w:cs="Times New Roman"/>
+        </w:rPr>
+        <w:tab/>
+      </w:r>
+      <w:r>
+        <w:rPr>
+          <w:rFonts w:ascii="Times New Roman" w:hAnsi="Times New Roman" w:cs="Times New Roman"/>
+        </w:rPr>
+        <w:t>u generând SQL dinamic) fără pierderi de informații.</w:t>
       </w:r>
     </w:p>
     <w:p>
@@ -4401,6 +4413,7 @@
   <w:style w:type="character" w:default="1" w:styleId="DefaultParagraphFont">
     <w:name w:val="Default Paragraph Font"/>
     <w:uiPriority w:val="1"/>
+    <w:semiHidden/>
     <w:unhideWhenUsed/>
   </w:style>
   <w:style w:type="table" w:default="1" w:styleId="TableNormal">

</xml_diff>